<commit_message>
Corrected refs in Tablele 1, shortened Intro
</commit_message>
<xml_diff>
--- a/supplementary7.docx
+++ b/supplementary7.docx
@@ -159,7 +159,7 @@
           <v:shape id="_x0000_i1025" type="#_x0000_t75" style="width:297.3pt;height:361.75pt" o:ole="">
             <v:imagedata r:id="rId5" o:title="" croptop="5243f" cropbottom="4588f" cropleft="3277f" cropright="4916f"/>
           </v:shape>
-          <o:OLEObject Type="Embed" ProgID="Origin50.Graph" ShapeID="_x0000_i1025" DrawAspect="Content" ObjectID="_1843595453" r:id="rId6"/>
+          <o:OLEObject Type="Embed" ProgID="Origin50.Graph" ShapeID="_x0000_i1025" DrawAspect="Content" ObjectID="_1843598586" r:id="rId6"/>
         </w:object>
       </w:r>
     </w:p>
@@ -255,7 +255,7 @@
           <v:shape id="_x0000_i1026" type="#_x0000_t75" style="width:298.6pt;height:362.65pt" o:ole="">
             <v:imagedata r:id="rId7" o:title="" croptop="5242f" cropbottom="4587f" cropleft="3277f" cropright="4916f"/>
           </v:shape>
-          <o:OLEObject Type="Embed" ProgID="Origin50.Graph" ShapeID="_x0000_i1026" DrawAspect="Content" ObjectID="_1843595454" r:id="rId8"/>
+          <o:OLEObject Type="Embed" ProgID="Origin50.Graph" ShapeID="_x0000_i1026" DrawAspect="Content" ObjectID="_1843598587" r:id="rId8"/>
         </w:object>
       </w:r>
     </w:p>
@@ -22673,8 +22673,6 @@
       <w:r>
         <w:t>4</w:t>
       </w:r>
-      <w:bookmarkStart w:id="0" w:name="_GoBack"/>
-      <w:bookmarkEnd w:id="0"/>
       <w:r>
         <w:t>A</w:t>
       </w:r>
@@ -22742,7 +22740,13 @@
         <w:t xml:space="preserve"> is shown</w:t>
       </w:r>
       <w:r>
-        <w:t xml:space="preserve"> in Fig. 2, monomer arrangement in Fig. 4A of the main text)</w:t>
+        <w:t xml:space="preserve"> in Fig. </w:t>
+      </w:r>
+      <w:r>
+        <w:t>5</w:t>
+      </w:r>
+      <w:r>
+        <w:t>, monomer arrangement in Fig. 4A of the main text)</w:t>
       </w:r>
     </w:p>
     <w:tbl>
@@ -26145,7 +26149,15 @@
         <w:t xml:space="preserve"> </w:t>
       </w:r>
       <w:r>
-        <w:t>(MO description is shown in Fig. 2, monomer arrangement in Fig. 4B of the main text)</w:t>
+        <w:t xml:space="preserve">(MO description is shown in Fig. </w:t>
+      </w:r>
+      <w:r>
+        <w:t>5</w:t>
+      </w:r>
+      <w:bookmarkStart w:id="0" w:name="_GoBack"/>
+      <w:bookmarkEnd w:id="0"/>
+      <w:r>
+        <w:t>, monomer arrangement in Fig. 4B of the main text)</w:t>
       </w:r>
     </w:p>
     <w:tbl>
@@ -29493,7 +29505,7 @@
           <v:shape id="_x0000_i1027" type="#_x0000_t75" style="width:280.5pt;height:217.35pt" o:ole="">
             <v:imagedata r:id="rId9" o:title="" croptop="3903f" cropbottom="2342f" cropleft="5516f" cropright="5516f"/>
           </v:shape>
-          <o:OLEObject Type="Embed" ProgID="Origin50.Graph" ShapeID="_x0000_i1027" DrawAspect="Content" ObjectID="_1843595455" r:id="rId10"/>
+          <o:OLEObject Type="Embed" ProgID="Origin50.Graph" ShapeID="_x0000_i1027" DrawAspect="Content" ObjectID="_1843598588" r:id="rId10"/>
         </w:object>
       </w:r>
     </w:p>
@@ -29523,7 +29535,7 @@
           <v:shape id="_x0000_i1028" type="#_x0000_t75" style="width:273.85pt;height:198.35pt" o:ole="">
             <v:imagedata r:id="rId11" o:title="" croptop="4100f" cropbottom="4100f" cropleft="5712f" cropright="5712f"/>
           </v:shape>
-          <o:OLEObject Type="Embed" ProgID="Origin50.Graph" ShapeID="_x0000_i1028" DrawAspect="Content" ObjectID="_1843595456" r:id="rId12"/>
+          <o:OLEObject Type="Embed" ProgID="Origin50.Graph" ShapeID="_x0000_i1028" DrawAspect="Content" ObjectID="_1843598589" r:id="rId12"/>
         </w:object>
       </w:r>
     </w:p>

</xml_diff>